<commit_message>
Add GEMINI_REALTIME_MODEL secret wiring and update AWS docs
</commit_message>
<xml_diff>
--- a/main/livekit-server/deploy/aws/Cheeko_AWS_Hosting_Procedure.docx
+++ b/main/livekit-server/deploy/aws/Cheeko_AWS_Hosting_Procedure.docx
@@ -4,43 +4,59 @@
   <w:body>
     <w:p>
       <w:pPr>
-        <w:jc w:val="center"/>
-      </w:pPr>
-      <w:r>
-        <w:rPr>
-          <w:b/>
-          <w:sz w:val="40"/>
-        </w:rPr>
-        <w:t>Cheeko Agent AWS Hosting Procedure</w:t>
-      </w:r>
-    </w:p>
-    <w:p>
-      <w:pPr>
-        <w:jc w:val="center"/>
-      </w:pPr>
-      <w:r>
-        <w:t>Version: 2026-05-12 | Region: ap-south-2 | Deployment: ECS Fargate</w:t>
-      </w:r>
-    </w:p>
-    <w:p>
-      <w:pPr>
         <w:pStyle w:val="Heading1"/>
       </w:pPr>
       <w:r>
-        <w:t>1. Scope</w:t>
+        <w:t>Cheeko Agent AWS Hosting Procedure (ECS Fargate)</w:t>
+      </w:r>
+    </w:p>
+    <w:p/>
+    <w:p>
+      <w:r>
+        <w:t xml:space="preserve">Last updated: 2026-05-12  </w:t>
       </w:r>
     </w:p>
     <w:p>
       <w:r>
-        <w:t>This runbook describes how to build, deploy, operate, and troubleshoot the Cheeko LiveKit worker on AWS ECS Fargate using the repository scripts under deploy/aws/cheeko-agent/.</w:t>
+        <w:t xml:space="preserve">Region: `ap-south-2`  </w:t>
       </w:r>
     </w:p>
     <w:p>
+      <w:r>
+        <w:t>Service: `cheeko-agent-service`</w:t>
+      </w:r>
+    </w:p>
+    <w:p/>
+    <w:p>
       <w:pPr>
-        <w:pStyle w:val="Heading1"/>
+        <w:pStyle w:val="Heading2"/>
       </w:pPr>
       <w:r>
-        <w:t>2. Deployment Architecture</w:t>
+        <w:t>1) Scope</w:t>
+      </w:r>
+    </w:p>
+    <w:p/>
+    <w:p>
+      <w:r>
+        <w:t>This runbook explains how to deploy, update, verify, and troubleshoot the Cheeko LiveKit worker on AWS ECS Fargate using scripts in `deploy/aws/cheeko-agent`.</w:t>
+      </w:r>
+    </w:p>
+    <w:p/>
+    <w:p>
+      <w:pPr>
+        <w:pStyle w:val="Heading2"/>
+      </w:pPr>
+      <w:r>
+        <w:t>2) Deployment Architecture</w:t>
+      </w:r>
+    </w:p>
+    <w:p/>
+    <w:p>
+      <w:pPr>
+        <w:pStyle w:val="ListBullet"/>
+      </w:pPr>
+      <w:r>
+        <w:t>ECR image repository: `cheeko-agent`</w:t>
       </w:r>
     </w:p>
     <w:p>
@@ -48,7 +64,7 @@
         <w:pStyle w:val="ListBullet"/>
       </w:pPr>
       <w:r>
-        <w:t>Container image in Amazon ECR: cheeko-agent</w:t>
+        <w:t>ECS cluster: `cheeko-agents-cluster`</w:t>
       </w:r>
     </w:p>
     <w:p>
@@ -56,7 +72,7 @@
         <w:pStyle w:val="ListBullet"/>
       </w:pPr>
       <w:r>
-        <w:t>Runtime on ECS Fargate service: cheeko-agent-service</w:t>
+        <w:t>ECS service: `cheeko-agent-service`</w:t>
       </w:r>
     </w:p>
     <w:p>
@@ -64,7 +80,7 @@
         <w:pStyle w:val="ListBullet"/>
       </w:pPr>
       <w:r>
-        <w:t>Cluster: cheeko-agents-cluster</w:t>
+        <w:t>Task family: `cheeko-agent`</w:t>
       </w:r>
     </w:p>
     <w:p>
@@ -72,7 +88,7 @@
         <w:pStyle w:val="ListBullet"/>
       </w:pPr>
       <w:r>
-        <w:t>Secrets in AWS Secrets Manager under prefix: prod/cheeko</w:t>
+        <w:t>CloudWatch log group: `/ecs/cheeko-agent`</w:t>
       </w:r>
     </w:p>
     <w:p>
@@ -80,31 +96,34 @@
         <w:pStyle w:val="ListBullet"/>
       </w:pPr>
       <w:r>
-        <w:t>Logs in CloudWatch log group: /ecs/cheeko-agent</w:t>
+        <w:t>Secrets Manager prefix: `prod/cheeko`</w:t>
       </w:r>
     </w:p>
-    <w:p>
-      <w:pPr>
-        <w:pStyle w:val="Heading1"/>
-      </w:pPr>
-      <w:r>
-        <w:t>3. One-Time Prerequisites</w:t>
-      </w:r>
-    </w:p>
+    <w:p/>
     <w:p>
       <w:pPr>
         <w:pStyle w:val="Heading2"/>
       </w:pPr>
       <w:r>
-        <w:t>3.1 Local Tools</w:t>
+        <w:t>3) Prerequisites</w:t>
       </w:r>
     </w:p>
+    <w:p/>
+    <w:p>
+      <w:pPr>
+        <w:pStyle w:val="Heading3"/>
+      </w:pPr>
+      <w:r>
+        <w:t>3.1 Local</w:t>
+      </w:r>
+    </w:p>
+    <w:p/>
     <w:p>
       <w:pPr>
         <w:pStyle w:val="ListBullet"/>
       </w:pPr>
       <w:r>
-        <w:t>AWS CLI v2 configured: aws configure</w:t>
+        <w:t>AWS CLI v2 installed and configured</w:t>
       </w:r>
     </w:p>
     <w:p>
@@ -120,15 +139,25 @@
         <w:pStyle w:val="ListBullet"/>
       </w:pPr>
       <w:r>
-        <w:t>PowerShell execution allowed for local scripts</w:t>
+        <w:t>Access to this repo and PowerShell</w:t>
       </w:r>
     </w:p>
+    <w:p/>
     <w:p>
       <w:pPr>
-        <w:pStyle w:val="Heading2"/>
+        <w:pStyle w:val="Heading3"/>
       </w:pPr>
       <w:r>
-        <w:t>3.2 AWS Resources</w:t>
+        <w:t>3.2 AWS</w:t>
+      </w:r>
+    </w:p>
+    <w:p/>
+    <w:p>
+      <w:pPr>
+        <w:pStyle w:val="ListBullet"/>
+      </w:pPr>
+      <w:r>
+        <w:t>ECS cluster exists</w:t>
       </w:r>
     </w:p>
     <w:p>
@@ -136,7 +165,7 @@
         <w:pStyle w:val="ListBullet"/>
       </w:pPr>
       <w:r>
-        <w:t>Region: ap-south-2</w:t>
+        <w:t>Subnets and security group available</w:t>
       </w:r>
     </w:p>
     <w:p>
@@ -144,7 +173,41 @@
         <w:pStyle w:val="ListBullet"/>
       </w:pPr>
       <w:r>
-        <w:t>ECS cluster: cheeko-agents-cluster</w:t>
+        <w:t>IAM roles exist:</w:t>
+      </w:r>
+    </w:p>
+    <w:p>
+      <w:r>
+        <w:t xml:space="preserve">  - `ecsTaskExecutionRole` (with `AmazonECSTaskExecutionRolePolicy`)</w:t>
+      </w:r>
+    </w:p>
+    <w:p>
+      <w:r>
+        <w:t xml:space="preserve">  - `cheekoAgentTaskRole`</w:t>
+      </w:r>
+    </w:p>
+    <w:p/>
+    <w:p>
+      <w:pPr>
+        <w:pStyle w:val="Heading3"/>
+      </w:pPr>
+      <w:r>
+        <w:t>3.3 Required Secrets</w:t>
+      </w:r>
+    </w:p>
+    <w:p/>
+    <w:p>
+      <w:r>
+        <w:t>Create or maintain these in Secrets Manager:</w:t>
+      </w:r>
+    </w:p>
+    <w:p/>
+    <w:p>
+      <w:pPr>
+        <w:pStyle w:val="ListBullet"/>
+      </w:pPr>
+      <w:r>
+        <w:t>`prod/cheeko/LIVEKIT_URL`</w:t>
       </w:r>
     </w:p>
     <w:p>
@@ -152,7 +215,7 @@
         <w:pStyle w:val="ListBullet"/>
       </w:pPr>
       <w:r>
-        <w:t>Subnets and security group for ECS service networking</w:t>
+        <w:t>`prod/cheeko/LIVEKIT_API_KEY`</w:t>
       </w:r>
     </w:p>
     <w:p>
@@ -160,7 +223,7 @@
         <w:pStyle w:val="ListBullet"/>
       </w:pPr>
       <w:r>
-        <w:t>IAM role: ecsTaskExecutionRole (AmazonECSTaskExecutionRolePolicy attached)</w:t>
+        <w:t>`prod/cheeko/LIVEKIT_API_SECRET`</w:t>
       </w:r>
     </w:p>
     <w:p>
@@ -168,15 +231,7 @@
         <w:pStyle w:val="ListBullet"/>
       </w:pPr>
       <w:r>
-        <w:t>IAM role: cheekoAgentTaskRole</w:t>
-      </w:r>
-    </w:p>
-    <w:p>
-      <w:pPr>
-        <w:pStyle w:val="Heading2"/>
-      </w:pPr>
-      <w:r>
-        <w:t>3.3 Required Secrets</w:t>
+        <w:t>`prod/cheeko/GOOGLE_API_KEY`</w:t>
       </w:r>
     </w:p>
     <w:p>
@@ -184,7 +239,7 @@
         <w:pStyle w:val="ListBullet"/>
       </w:pPr>
       <w:r>
-        <w:t>prod/cheeko/LIVEKIT_URL</w:t>
+        <w:t>`prod/cheeko/GEMINI_REALTIME_MODEL`</w:t>
       </w:r>
     </w:p>
     <w:p>
@@ -192,7 +247,7 @@
         <w:pStyle w:val="ListBullet"/>
       </w:pPr>
       <w:r>
-        <w:t>prod/cheeko/LIVEKIT_API_KEY</w:t>
+        <w:t>`prod/cheeko/MANAGER_API_URL`</w:t>
       </w:r>
     </w:p>
     <w:p>
@@ -200,7 +255,7 @@
         <w:pStyle w:val="ListBullet"/>
       </w:pPr>
       <w:r>
-        <w:t>prod/cheeko/LIVEKIT_API_SECRET</w:t>
+        <w:t>`prod/cheeko/MANAGER_API_SECRET`</w:t>
       </w:r>
     </w:p>
     <w:p>
@@ -208,7 +263,7 @@
         <w:pStyle w:val="ListBullet"/>
       </w:pPr>
       <w:r>
-        <w:t>prod/cheeko/GOOGLE_API_KEY</w:t>
+        <w:t>`prod/cheeko/ELEVEN_API_KEY`</w:t>
       </w:r>
     </w:p>
     <w:p>
@@ -216,7 +271,7 @@
         <w:pStyle w:val="ListBullet"/>
       </w:pPr>
       <w:r>
-        <w:t>prod/cheeko/MANAGER_API_URL</w:t>
+        <w:t>`prod/cheeko/ELEVENLABS_VOICE_ID`</w:t>
       </w:r>
     </w:p>
     <w:p>
@@ -224,7 +279,7 @@
         <w:pStyle w:val="ListBullet"/>
       </w:pPr>
       <w:r>
-        <w:t>prod/cheeko/MANAGER_API_SECRET</w:t>
+        <w:t>`prod/cheeko/MEM0_API_KEY`</w:t>
       </w:r>
     </w:p>
     <w:p>
@@ -232,7 +287,7 @@
         <w:pStyle w:val="ListBullet"/>
       </w:pPr>
       <w:r>
-        <w:t>prod/cheeko/ELEVEN_API_KEY</w:t>
+        <w:t>`prod/cheeko/QDRANT_URL`</w:t>
       </w:r>
     </w:p>
     <w:p>
@@ -240,7 +295,25 @@
         <w:pStyle w:val="ListBullet"/>
       </w:pPr>
       <w:r>
-        <w:t>prod/cheeko/ELEVENLABS_VOICE_ID</w:t>
+        <w:t>`prod/cheeko/QDRANT_API_KEY`</w:t>
+      </w:r>
+    </w:p>
+    <w:p/>
+    <w:p>
+      <w:pPr>
+        <w:pStyle w:val="Heading3"/>
+      </w:pPr>
+      <w:r>
+        <w:t>3.4 Gemini model mode (important)</w:t>
+      </w:r>
+    </w:p>
+    <w:p/>
+    <w:p>
+      <w:pPr>
+        <w:pStyle w:val="ListBullet"/>
+      </w:pPr>
+      <w:r>
+        <w:t>Keep `GEMINI_REALTIME_MODEL` set to a non-`gemini-live-*` value (recommended: `gemini-2.5-flash-native-audio-latest`) for Gemini API mode.</w:t>
       </w:r>
     </w:p>
     <w:p>
@@ -248,7 +321,7 @@
         <w:pStyle w:val="ListBullet"/>
       </w:pPr>
       <w:r>
-        <w:t>prod/cheeko/MEM0_API_KEY</w:t>
+        <w:t>`gemini-live-*` models are treated as Vertex-style models.</w:t>
       </w:r>
     </w:p>
     <w:p>
@@ -256,30 +329,31 @@
         <w:pStyle w:val="ListBullet"/>
       </w:pPr>
       <w:r>
-        <w:t>prod/cheeko/QDRANT_URL</w:t>
+        <w:t>`GEMINI_USE_VERTEXAI=true` forces Vertex mode.</w:t>
       </w:r>
     </w:p>
+    <w:p/>
     <w:p>
       <w:pPr>
-        <w:pStyle w:val="ListBullet"/>
+        <w:pStyle w:val="Heading2"/>
       </w:pPr>
       <w:r>
-        <w:t>prod/cheeko/QDRANT_API_KEY</w:t>
+        <w:t>4) First Deployment (One Command)</w:t>
       </w:r>
     </w:p>
+    <w:p/>
     <w:p>
-      <w:pPr>
-        <w:pStyle w:val="Heading1"/>
-      </w:pPr>
       <w:r>
-        <w:t>4. First Deployment (Recommended Script)</w:t>
+        <w:t>Run from:</w:t>
       </w:r>
     </w:p>
+    <w:p/>
     <w:p>
       <w:r>
-        <w:t>Run from: D:\cheeko-backend\main\livekit-server</w:t>
+        <w:t>`D:\cheeko-backend\main\livekit-server`</w:t>
       </w:r>
     </w:p>
+    <w:p/>
     <w:p>
       <w:r>
         <w:rPr>
@@ -477,43 +551,73 @@
         <w:t xml:space="preserve">  -DesiredCount 1</w:t>
       </w:r>
     </w:p>
+    <w:p/>
     <w:p>
       <w:r>
-        <w:t>What this script does: build/push image, sync secrets from .env to Secrets Manager, register task definition, and create/update ECS service.</w:t>
+        <w:t>What this does:</w:t>
+      </w:r>
+    </w:p>
+    <w:p/>
+    <w:p>
+      <w:r>
+        <w:t>1. Builds Docker image and pushes to ECR</w:t>
       </w:r>
     </w:p>
     <w:p>
-      <w:pPr>
-        <w:pStyle w:val="Heading1"/>
-      </w:pPr>
       <w:r>
-        <w:t>5. Safe Deployment Sequence for Updates</w:t>
+        <w:t>2. Syncs `.env` keys to Secrets Manager</w:t>
       </w:r>
     </w:p>
     <w:p>
-      <w:pPr>
-        <w:pStyle w:val="ListNumber"/>
-      </w:pPr>
       <w:r>
-        <w:t>Update local .env values first (so deploy script does not overwrite Secrets Manager with stale localhost/dev values).</w:t>
+        <w:t>3. Registers ECS task definition</w:t>
       </w:r>
     </w:p>
     <w:p>
+      <w:r>
+        <w:t>4. Creates/updates ECS service</w:t>
+      </w:r>
+    </w:p>
+    <w:p/>
+    <w:p>
       <w:pPr>
-        <w:pStyle w:val="ListNumber"/>
+        <w:pStyle w:val="Heading2"/>
       </w:pPr>
       <w:r>
-        <w:t>Deploy with a new image tag (v2, v3, ...).</w:t>
+        <w:t>5) Safe Update Flow (Important)</w:t>
+      </w:r>
+    </w:p>
+    <w:p/>
+    <w:p>
+      <w:r>
+        <w:t>1. Update local `.env` first so deploy script does not push stale `localhost` values into AWS secrets.</w:t>
       </w:r>
     </w:p>
     <w:p>
+      <w:r>
+        <w:t>2. Deploy with a new image tag (`v2`, `v3`, ...).</w:t>
+      </w:r>
+    </w:p>
+    <w:p>
+      <w:r>
+        <w:t>3. Wait for service stability.</w:t>
+      </w:r>
+    </w:p>
+    <w:p>
+      <w:r>
+        <w:t>4. Verify logs and test one real job.</w:t>
+      </w:r>
+    </w:p>
+    <w:p/>
+    <w:p>
       <w:pPr>
-        <w:pStyle w:val="ListNumber"/>
+        <w:pStyle w:val="Heading2"/>
       </w:pPr>
       <w:r>
-        <w:t>Wait for service stability and verify logs.</w:t>
+        <w:t>6) Verification Commands</w:t>
       </w:r>
     </w:p>
+    <w:p/>
     <w:p>
       <w:r>
         <w:rPr>
@@ -529,25 +633,67 @@
           <w:rFonts w:ascii="Consolas" w:hAnsi="Consolas" w:eastAsia="Consolas"/>
           <w:sz w:val="20"/>
         </w:rPr>
+      </w:r>
+    </w:p>
+    <w:p>
+      <w:r>
+        <w:rPr>
+          <w:rFonts w:ascii="Consolas" w:hAnsi="Consolas" w:eastAsia="Consolas"/>
+          <w:sz w:val="20"/>
+        </w:rPr>
         <w:t>aws ecs describe-services --region ap-south-2 --cluster cheeko-agents-cluster --services cheeko-agent-service --query "services[0].{taskDef:taskDefinition,desired:desiredCount,running:runningCount,pending:pendingCount}" --output json</w:t>
+      </w:r>
+    </w:p>
+    <w:p/>
+    <w:p>
+      <w:r>
+        <w:t>Expected healthy state:</w:t>
+      </w:r>
+    </w:p>
+    <w:p/>
+    <w:p>
+      <w:pPr>
+        <w:pStyle w:val="ListBullet"/>
+      </w:pPr>
+      <w:r>
+        <w:t>`desired=1`</w:t>
       </w:r>
     </w:p>
     <w:p>
       <w:pPr>
-        <w:pStyle w:val="Heading1"/>
+        <w:pStyle w:val="ListBullet"/>
       </w:pPr>
       <w:r>
-        <w:t>6. Runtime Operations</w:t>
+        <w:t>`running=1`</w:t>
       </w:r>
     </w:p>
+    <w:p>
+      <w:pPr>
+        <w:pStyle w:val="ListBullet"/>
+      </w:pPr>
+      <w:r>
+        <w:t>`pending=0`</w:t>
+      </w:r>
+    </w:p>
+    <w:p/>
     <w:p>
       <w:pPr>
         <w:pStyle w:val="Heading2"/>
       </w:pPr>
       <w:r>
-        <w:t>6.1 Force New Deployment Without Rebuild</w:t>
+        <w:t>7) Operations</w:t>
       </w:r>
     </w:p>
+    <w:p/>
+    <w:p>
+      <w:pPr>
+        <w:pStyle w:val="Heading3"/>
+      </w:pPr>
+      <w:r>
+        <w:t>7.1 Force new deployment without rebuild</w:t>
+      </w:r>
+    </w:p>
+    <w:p/>
     <w:p>
       <w:r>
         <w:rPr>
@@ -557,14 +703,16 @@
         <w:t>aws ecs update-service --region ap-south-2 --cluster cheeko-agents-cluster --service cheeko-agent-service --force-new-deployment</w:t>
       </w:r>
     </w:p>
+    <w:p/>
     <w:p>
       <w:pPr>
-        <w:pStyle w:val="Heading2"/>
+        <w:pStyle w:val="Heading3"/>
       </w:pPr>
       <w:r>
-        <w:t>6.2 Update a Single Secret</w:t>
+        <w:t>7.2 Update one secret and restart service</w:t>
       </w:r>
     </w:p>
+    <w:p/>
     <w:p>
       <w:r>
         <w:rPr>
@@ -583,14 +731,16 @@
         <w:t>aws ecs update-service --region ap-south-2 --cluster cheeko-agents-cluster --service cheeko-agent-service --force-new-deployment</w:t>
       </w:r>
     </w:p>
+    <w:p/>
     <w:p>
       <w:pPr>
-        <w:pStyle w:val="Heading2"/>
+        <w:pStyle w:val="Heading3"/>
       </w:pPr>
       <w:r>
-        <w:t>6.3 Validate Current Secret Values</w:t>
+        <w:t>7.3 Check current production secret values</w:t>
       </w:r>
     </w:p>
+    <w:p/>
     <w:p>
       <w:r>
         <w:rPr>
@@ -628,13 +778,24 @@
       </w:r>
     </w:p>
     <w:p>
+      <w:r>
+        <w:rPr>
+          <w:rFonts w:ascii="Consolas" w:hAnsi="Consolas" w:eastAsia="Consolas"/>
+          <w:sz w:val="20"/>
+        </w:rPr>
+        <w:t>aws secretsmanager get-secret-value --region ap-south-2 --secret-id prod/cheeko/GEMINI_REALTIME_MODEL --query SecretString --output text</w:t>
+      </w:r>
+    </w:p>
+    <w:p/>
+    <w:p>
       <w:pPr>
         <w:pStyle w:val="Heading2"/>
       </w:pPr>
       <w:r>
-        <w:t>6.4 CloudWatch Logs</w:t>
+        <w:t>8) Logs</w:t>
       </w:r>
     </w:p>
+    <w:p/>
     <w:p>
       <w:r>
         <w:rPr>
@@ -653,20 +814,98 @@
         <w:t>aws logs tail /ecs/cheeko-agent --region ap-south-2 --since 30m</w:t>
       </w:r>
     </w:p>
-    <w:p>
-      <w:pPr>
-        <w:pStyle w:val="Heading1"/>
-      </w:pPr>
-      <w:r>
-        <w:t>7. Known Issues and Fixes</w:t>
-      </w:r>
-    </w:p>
+    <w:p/>
     <w:p>
       <w:pPr>
         <w:pStyle w:val="Heading2"/>
       </w:pPr>
       <w:r>
-        <w:t>7.1 Old localhost credentials appear in ECS logs</w:t>
+        <w:t>9) Known Failure Modes and Fixes</w:t>
+      </w:r>
+    </w:p>
+    <w:p/>
+    <w:p>
+      <w:pPr>
+        <w:pStyle w:val="Heading3"/>
+      </w:pPr>
+      <w:r>
+        <w:t>9.1 Old local credentials overwrite AWS</w:t>
+      </w:r>
+    </w:p>
+    <w:p/>
+    <w:p>
+      <w:r>
+        <w:t>Symptom:</w:t>
+      </w:r>
+    </w:p>
+    <w:p/>
+    <w:p>
+      <w:pPr>
+        <w:pStyle w:val="ListBullet"/>
+      </w:pPr>
+      <w:r>
+        <w:t>Service starts with `ws://localhost:7880` or `127.0.0.1:8002`</w:t>
+      </w:r>
+    </w:p>
+    <w:p/>
+    <w:p>
+      <w:r>
+        <w:t>Cause:</w:t>
+      </w:r>
+    </w:p>
+    <w:p/>
+    <w:p>
+      <w:pPr>
+        <w:pStyle w:val="ListBullet"/>
+      </w:pPr>
+      <w:r>
+        <w:t>Deploy script syncs from `.env` each run.</w:t>
+      </w:r>
+    </w:p>
+    <w:p/>
+    <w:p>
+      <w:r>
+        <w:t>Fix:</w:t>
+      </w:r>
+    </w:p>
+    <w:p/>
+    <w:p>
+      <w:r>
+        <w:t>1. Correct `.env`</w:t>
+      </w:r>
+    </w:p>
+    <w:p>
+      <w:r>
+        <w:t>2. Re-run deploy script or update secrets manually</w:t>
+      </w:r>
+    </w:p>
+    <w:p>
+      <w:r>
+        <w:t>3. Force new deployment</w:t>
+      </w:r>
+    </w:p>
+    <w:p/>
+    <w:p>
+      <w:pPr>
+        <w:pStyle w:val="Heading3"/>
+      </w:pPr>
+      <w:r>
+        <w:t>9.2 Jinja prompt template parse error + child profile None crash</w:t>
+      </w:r>
+    </w:p>
+    <w:p/>
+    <w:p>
+      <w:r>
+        <w:t>Symptom:</w:t>
+      </w:r>
+    </w:p>
+    <w:p/>
+    <w:p>
+      <w:pPr>
+        <w:pStyle w:val="ListBullet"/>
+      </w:pPr>
+      <w:r>
+        <w:t>`Jinja2 template error: tag name expected`</w:t>
       </w:r>
     </w:p>
     <w:p>
@@ -674,70 +913,88 @@
         <w:pStyle w:val="ListBullet"/>
       </w:pPr>
       <w:r>
-        <w:t>Cause: deploy script syncs from local .env and can overwrite AWS secrets.</w:t>
+        <w:t>Then `AttributeError: 'NoneType' object has no attribute 'get'`</w:t>
       </w:r>
     </w:p>
+    <w:p/>
+    <w:p>
+      <w:r>
+        <w:t>Fix already applied:</w:t>
+      </w:r>
+    </w:p>
+    <w:p/>
     <w:p>
       <w:pPr>
         <w:pStyle w:val="ListBullet"/>
       </w:pPr>
       <w:r>
-        <w:t>Fix: correct .env first, redeploy, and verify with secretsmanager get-secret-value.</w:t>
+        <w:t>Safe fallback rendering in `src/shared/entrypoint_utils.py`</w:t>
       </w:r>
     </w:p>
+    <w:p/>
+    <w:p>
+      <w:pPr>
+        <w:pStyle w:val="Heading3"/>
+      </w:pPr>
+      <w:r>
+        <w:t>9.3 Vertex model selected but no Google ADC in ECS</w:t>
+      </w:r>
+    </w:p>
+    <w:p/>
+    <w:p>
+      <w:r>
+        <w:t>Symptom:</w:t>
+      </w:r>
+    </w:p>
+    <w:p/>
+    <w:p>
+      <w:pPr>
+        <w:pStyle w:val="ListBullet"/>
+      </w:pPr>
+      <w:r>
+        <w:t>`google.auth.exceptions.DefaultCredentialsError`</w:t>
+      </w:r>
+    </w:p>
+    <w:p/>
+    <w:p>
+      <w:r>
+        <w:t>Cause:</w:t>
+      </w:r>
+    </w:p>
+    <w:p/>
+    <w:p>
+      <w:pPr>
+        <w:pStyle w:val="ListBullet"/>
+      </w:pPr>
+      <w:r>
+        <w:t>Vertex model (`gemini-live-*`) requires ADC credentials in container.</w:t>
+      </w:r>
+    </w:p>
+    <w:p/>
+    <w:p>
+      <w:r>
+        <w:t>Fix already applied:</w:t>
+      </w:r>
+    </w:p>
+    <w:p/>
+    <w:p>
+      <w:pPr>
+        <w:pStyle w:val="ListBullet"/>
+      </w:pPr>
+      <w:r>
+        <w:t>Worker fallback to Gemini API model when Vertex ADC/project env is missing.</w:t>
+      </w:r>
+    </w:p>
+    <w:p/>
     <w:p>
       <w:pPr>
         <w:pStyle w:val="Heading2"/>
       </w:pPr>
       <w:r>
-        <w:t>7.2 Jinja prompt parsing error followed by child_profile None crash</w:t>
+        <w:t>10) Rollback</w:t>
       </w:r>
     </w:p>
-    <w:p>
-      <w:pPr>
-        <w:pStyle w:val="ListBullet"/>
-      </w:pPr>
-      <w:r>
-        <w:t>Fix already added in code: safe fallback handling in src/shared/entrypoint_utils.py.</w:t>
-      </w:r>
-    </w:p>
-    <w:p>
-      <w:pPr>
-        <w:pStyle w:val="Heading2"/>
-      </w:pPr>
-      <w:r>
-        <w:t>7.3 Vertex model error / ADC missing in ECS</w:t>
-      </w:r>
-    </w:p>
-    <w:p>
-      <w:pPr>
-        <w:pStyle w:val="ListBullet"/>
-      </w:pPr>
-      <w:r>
-        <w:t>If model is gemini-live-* and vertexai mode is used, Google ADC is required in container.</w:t>
-      </w:r>
-    </w:p>
-    <w:p>
-      <w:pPr>
-        <w:pStyle w:val="ListBullet"/>
-      </w:pPr>
-      <w:r>
-        <w:t>Fix already added in code: automatic fallback to Gemini API model when ADC/project env is missing.</w:t>
-      </w:r>
-    </w:p>
-    <w:p>
-      <w:pPr>
-        <w:pStyle w:val="Heading1"/>
-      </w:pPr>
-      <w:r>
-        <w:t>8. Rollback</w:t>
-      </w:r>
-    </w:p>
-    <w:p>
-      <w:r>
-        <w:t>To rollback, update ECS service to a previous known-good task definition revision.</w:t>
-      </w:r>
-    </w:p>
+    <w:p/>
     <w:p>
       <w:r>
         <w:rPr>
@@ -747,52 +1004,22 @@
         <w:t>aws ecs update-service --region ap-south-2 --cluster cheeko-agents-cluster --service cheeko-agent-service --task-definition cheeko-agent:&lt;older-revision&gt;</w:t>
       </w:r>
     </w:p>
+    <w:p/>
     <w:p>
       <w:pPr>
-        <w:pStyle w:val="Heading1"/>
+        <w:pStyle w:val="Heading2"/>
       </w:pPr>
       <w:r>
-        <w:t>9. Final Verification Checklist</w:t>
+        <w:t>11) Key Files in Repo</w:t>
       </w:r>
     </w:p>
+    <w:p/>
     <w:p>
       <w:pPr>
-        <w:pStyle w:val="ListNumber"/>
+        <w:pStyle w:val="ListBullet"/>
       </w:pPr>
       <w:r>
-        <w:t>ECS service shows desired=1, running=1, pending=0.</w:t>
-      </w:r>
-    </w:p>
-    <w:p>
-      <w:pPr>
-        <w:pStyle w:val="ListNumber"/>
-      </w:pPr>
-      <w:r>
-        <w:t>CloudWatch logs show registered worker without unhandled exception.</w:t>
-      </w:r>
-    </w:p>
-    <w:p>
-      <w:pPr>
-        <w:pStyle w:val="ListNumber"/>
-      </w:pPr>
-      <w:r>
-        <w:t>LiveKit test room joins successfully and responds to user audio.</w:t>
-      </w:r>
-    </w:p>
-    <w:p>
-      <w:pPr>
-        <w:pStyle w:val="ListNumber"/>
-      </w:pPr>
-      <w:r>
-        <w:t>Secrets in prod/cheeko match intended production values.</w:t>
-      </w:r>
-    </w:p>
-    <w:p>
-      <w:pPr>
-        <w:pStyle w:val="Heading1"/>
-      </w:pPr>
-      <w:r>
-        <w:t>10. File References in Repository</w:t>
+        <w:t>`deploy/aws/README.md`</w:t>
       </w:r>
     </w:p>
     <w:p>
@@ -800,7 +1027,7 @@
         <w:pStyle w:val="ListBullet"/>
       </w:pPr>
       <w:r>
-        <w:t>deploy/aws/README.md</w:t>
+        <w:t>`deploy/aws/cheeko-agent/deploy-cheeko-agent.ps1`</w:t>
       </w:r>
     </w:p>
     <w:p>
@@ -808,7 +1035,7 @@
         <w:pStyle w:val="ListBullet"/>
       </w:pPr>
       <w:r>
-        <w:t>deploy/aws/cheeko-agent/deploy-cheeko-agent.ps1</w:t>
+        <w:t>`deploy/aws/cheeko-agent/build-and-push-image.ps1`</w:t>
       </w:r>
     </w:p>
     <w:p>
@@ -816,7 +1043,7 @@
         <w:pStyle w:val="ListBullet"/>
       </w:pPr>
       <w:r>
-        <w:t>deploy/aws/cheeko-agent/build-and-push-image.ps1</w:t>
+        <w:t>`deploy/aws/cheeko-agent/create-or-update-secret.ps1`</w:t>
       </w:r>
     </w:p>
     <w:p>
@@ -824,7 +1051,7 @@
         <w:pStyle w:val="ListBullet"/>
       </w:pPr>
       <w:r>
-        <w:t>deploy/aws/cheeko-agent/create-or-update-secret.ps1</w:t>
+        <w:t>`deploy/aws/cheeko-agent/register-task-definition.ps1`</w:t>
       </w:r>
     </w:p>
     <w:p>
@@ -832,7 +1059,7 @@
         <w:pStyle w:val="ListBullet"/>
       </w:pPr>
       <w:r>
-        <w:t>deploy/aws/cheeko-agent/register-task-definition.ps1</w:t>
+        <w:t>`deploy/aws/cheeko-agent/create-or-update-service.ps1`</w:t>
       </w:r>
     </w:p>
     <w:p>
@@ -840,7 +1067,7 @@
         <w:pStyle w:val="ListBullet"/>
       </w:pPr>
       <w:r>
-        <w:t>deploy/aws/cheeko-agent/create-or-update-service.ps1</w:t>
+        <w:t>`Dockerfile.aws-cheeko`</w:t>
       </w:r>
     </w:p>
     <w:p>
@@ -848,15 +1075,7 @@
         <w:pStyle w:val="ListBullet"/>
       </w:pPr>
       <w:r>
-        <w:t>Dockerfile.aws-cheeko</w:t>
-      </w:r>
-    </w:p>
-    <w:p>
-      <w:pPr>
-        <w:pStyle w:val="ListBullet"/>
-      </w:pPr>
-      <w:r>
-        <w:t>start-aws-cheeko.sh</w:t>
+        <w:t>`start-aws-cheeko.sh`</w:t>
       </w:r>
     </w:p>
     <w:sectPr>

</xml_diff>

<commit_message>
Add Fargate autoscaling workflow and load monitoring docs
</commit_message>
<xml_diff>
--- a/main/livekit-server/deploy/aws/Cheeko_AWS_Hosting_Procedure.docx
+++ b/main/livekit-server/deploy/aws/Cheeko_AWS_Hosting_Procedure.docx
@@ -330,6 +330,40 @@
       </w:pPr>
       <w:r>
         <w:t>`GEMINI_USE_VERTEXAI=true` forces Vertex mode.</w:t>
+      </w:r>
+    </w:p>
+    <w:p/>
+    <w:p>
+      <w:pPr>
+        <w:pStyle w:val="Heading3"/>
+      </w:pPr>
+      <w:r>
+        <w:t>3.5 Autoscaling model (important)</w:t>
+      </w:r>
+    </w:p>
+    <w:p/>
+    <w:p>
+      <w:pPr>
+        <w:pStyle w:val="ListBullet"/>
+      </w:pPr>
+      <w:r>
+        <w:t>Worker admission control: `LIVEKIT_LOAD_THRESHOLD` (default now `0.7` in `workers/cheeko_worker.py`)</w:t>
+      </w:r>
+    </w:p>
+    <w:p>
+      <w:pPr>
+        <w:pStyle w:val="ListBullet"/>
+      </w:pPr>
+      <w:r>
+        <w:t>Service autoscaling: ECS target tracking on CPU</w:t>
+      </w:r>
+    </w:p>
+    <w:p>
+      <w:pPr>
+        <w:pStyle w:val="ListBullet"/>
+      </w:pPr>
+      <w:r>
+        <w:t>Recommended starting target: CPU `50%` so scale-out happens before workers saturate near `0.7`</w:t>
       </w:r>
     </w:p>
     <w:p/>
@@ -789,6 +823,366 @@
     <w:p/>
     <w:p>
       <w:pPr>
+        <w:pStyle w:val="Heading3"/>
+      </w:pPr>
+      <w:r>
+        <w:t>7.4 Configure ECS autoscaling (Fargate)</w:t>
+      </w:r>
+    </w:p>
+    <w:p/>
+    <w:p>
+      <w:r>
+        <w:rPr>
+          <w:rFonts w:ascii="Consolas" w:hAnsi="Consolas" w:eastAsia="Consolas"/>
+          <w:sz w:val="20"/>
+        </w:rPr>
+        <w:t>.\deploy\aws\cheeko-agent\configure-autoscaling.ps1 `</w:t>
+      </w:r>
+    </w:p>
+    <w:p>
+      <w:r>
+        <w:rPr>
+          <w:rFonts w:ascii="Consolas" w:hAnsi="Consolas" w:eastAsia="Consolas"/>
+          <w:sz w:val="20"/>
+        </w:rPr>
+        <w:t xml:space="preserve">  -Region "ap-south-2" `</w:t>
+      </w:r>
+    </w:p>
+    <w:p>
+      <w:r>
+        <w:rPr>
+          <w:rFonts w:ascii="Consolas" w:hAnsi="Consolas" w:eastAsia="Consolas"/>
+          <w:sz w:val="20"/>
+        </w:rPr>
+        <w:t xml:space="preserve">  -ClusterName "cheeko-agents-cluster" `</w:t>
+      </w:r>
+    </w:p>
+    <w:p>
+      <w:r>
+        <w:rPr>
+          <w:rFonts w:ascii="Consolas" w:hAnsi="Consolas" w:eastAsia="Consolas"/>
+          <w:sz w:val="20"/>
+        </w:rPr>
+        <w:t xml:space="preserve">  -ServiceName "cheeko-agent-service" `</w:t>
+      </w:r>
+    </w:p>
+    <w:p>
+      <w:r>
+        <w:rPr>
+          <w:rFonts w:ascii="Consolas" w:hAnsi="Consolas" w:eastAsia="Consolas"/>
+          <w:sz w:val="20"/>
+        </w:rPr>
+        <w:t xml:space="preserve">  -MinCapacity 1 `</w:t>
+      </w:r>
+    </w:p>
+    <w:p>
+      <w:r>
+        <w:rPr>
+          <w:rFonts w:ascii="Consolas" w:hAnsi="Consolas" w:eastAsia="Consolas"/>
+          <w:sz w:val="20"/>
+        </w:rPr>
+        <w:t xml:space="preserve">  -MaxCapacity 5 `</w:t>
+      </w:r>
+    </w:p>
+    <w:p>
+      <w:r>
+        <w:rPr>
+          <w:rFonts w:ascii="Consolas" w:hAnsi="Consolas" w:eastAsia="Consolas"/>
+          <w:sz w:val="20"/>
+        </w:rPr>
+        <w:t xml:space="preserve">  -TargetCPU 50 `</w:t>
+      </w:r>
+    </w:p>
+    <w:p>
+      <w:r>
+        <w:rPr>
+          <w:rFonts w:ascii="Consolas" w:hAnsi="Consolas" w:eastAsia="Consolas"/>
+          <w:sz w:val="20"/>
+        </w:rPr>
+        <w:t xml:space="preserve">  -ScaleOutCooldown 60 `</w:t>
+      </w:r>
+    </w:p>
+    <w:p>
+      <w:r>
+        <w:rPr>
+          <w:rFonts w:ascii="Consolas" w:hAnsi="Consolas" w:eastAsia="Consolas"/>
+          <w:sz w:val="20"/>
+        </w:rPr>
+        <w:t xml:space="preserve">  -ScaleInCooldown 300</w:t>
+      </w:r>
+    </w:p>
+    <w:p/>
+    <w:p>
+      <w:pPr>
+        <w:pStyle w:val="Heading3"/>
+      </w:pPr>
+      <w:r>
+        <w:t>7.5 Verify autoscaling configuration</w:t>
+      </w:r>
+    </w:p>
+    <w:p/>
+    <w:p>
+      <w:r>
+        <w:rPr>
+          <w:rFonts w:ascii="Consolas" w:hAnsi="Consolas" w:eastAsia="Consolas"/>
+          <w:sz w:val="20"/>
+        </w:rPr>
+        <w:t>aws application-autoscaling describe-scalable-targets --region ap-south-2 --service-namespace ecs --resource-id service/cheeko-agents-cluster/cheeko-agent-service --scalable-dimension ecs:service:DesiredCount --output json</w:t>
+      </w:r>
+    </w:p>
+    <w:p>
+      <w:r>
+        <w:rPr>
+          <w:rFonts w:ascii="Consolas" w:hAnsi="Consolas" w:eastAsia="Consolas"/>
+          <w:sz w:val="20"/>
+        </w:rPr>
+        <w:t>aws application-autoscaling describe-scaling-policies --region ap-south-2 --service-namespace ecs --resource-id service/cheeko-agents-cluster/cheeko-agent-service --scalable-dimension ecs:service:DesiredCount --output json</w:t>
+      </w:r>
+    </w:p>
+    <w:p/>
+    <w:p>
+      <w:pPr>
+        <w:pStyle w:val="Heading3"/>
+      </w:pPr>
+      <w:r>
+        <w:t>7.6 Check runtime load (CPU/Memory)</w:t>
+      </w:r>
+    </w:p>
+    <w:p/>
+    <w:p>
+      <w:r>
+        <w:t>Use UTC timestamps for CloudWatch queries:</w:t>
+      </w:r>
+    </w:p>
+    <w:p/>
+    <w:p>
+      <w:r>
+        <w:rPr>
+          <w:rFonts w:ascii="Consolas" w:hAnsi="Consolas" w:eastAsia="Consolas"/>
+          <w:sz w:val="20"/>
+        </w:rPr>
+        <w:t>$start = (Get-Date).ToUniversalTime().AddHours(-2).ToString("yyyy-MM-ddTHH:mm:ssZ")</w:t>
+      </w:r>
+    </w:p>
+    <w:p>
+      <w:r>
+        <w:rPr>
+          <w:rFonts w:ascii="Consolas" w:hAnsi="Consolas" w:eastAsia="Consolas"/>
+          <w:sz w:val="20"/>
+        </w:rPr>
+        <w:t>$end   = (Get-Date).ToUniversalTime().ToString("yyyy-MM-ddTHH:mm:ssZ")</w:t>
+      </w:r>
+    </w:p>
+    <w:p/>
+    <w:p>
+      <w:r>
+        <w:t>CPU:</w:t>
+      </w:r>
+    </w:p>
+    <w:p/>
+    <w:p>
+      <w:r>
+        <w:rPr>
+          <w:rFonts w:ascii="Consolas" w:hAnsi="Consolas" w:eastAsia="Consolas"/>
+          <w:sz w:val="20"/>
+        </w:rPr>
+        <w:t>aws cloudwatch get-metric-statistics `</w:t>
+      </w:r>
+    </w:p>
+    <w:p>
+      <w:r>
+        <w:rPr>
+          <w:rFonts w:ascii="Consolas" w:hAnsi="Consolas" w:eastAsia="Consolas"/>
+          <w:sz w:val="20"/>
+        </w:rPr>
+        <w:t xml:space="preserve">  --region ap-south-2 `</w:t>
+      </w:r>
+    </w:p>
+    <w:p>
+      <w:r>
+        <w:rPr>
+          <w:rFonts w:ascii="Consolas" w:hAnsi="Consolas" w:eastAsia="Consolas"/>
+          <w:sz w:val="20"/>
+        </w:rPr>
+        <w:t xml:space="preserve">  --namespace AWS/ECS `</w:t>
+      </w:r>
+    </w:p>
+    <w:p>
+      <w:r>
+        <w:rPr>
+          <w:rFonts w:ascii="Consolas" w:hAnsi="Consolas" w:eastAsia="Consolas"/>
+          <w:sz w:val="20"/>
+        </w:rPr>
+        <w:t xml:space="preserve">  --metric-name CPUUtilization `</w:t>
+      </w:r>
+    </w:p>
+    <w:p>
+      <w:r>
+        <w:rPr>
+          <w:rFonts w:ascii="Consolas" w:hAnsi="Consolas" w:eastAsia="Consolas"/>
+          <w:sz w:val="20"/>
+        </w:rPr>
+        <w:t xml:space="preserve">  --dimensions Name=ClusterName,Value=cheeko-agents-cluster Name=ServiceName,Value=cheeko-agent-service `</w:t>
+      </w:r>
+    </w:p>
+    <w:p>
+      <w:r>
+        <w:rPr>
+          <w:rFonts w:ascii="Consolas" w:hAnsi="Consolas" w:eastAsia="Consolas"/>
+          <w:sz w:val="20"/>
+        </w:rPr>
+        <w:t xml:space="preserve">  --start-time $start `</w:t>
+      </w:r>
+    </w:p>
+    <w:p>
+      <w:r>
+        <w:rPr>
+          <w:rFonts w:ascii="Consolas" w:hAnsi="Consolas" w:eastAsia="Consolas"/>
+          <w:sz w:val="20"/>
+        </w:rPr>
+        <w:t xml:space="preserve">  --end-time $end `</w:t>
+      </w:r>
+    </w:p>
+    <w:p>
+      <w:r>
+        <w:rPr>
+          <w:rFonts w:ascii="Consolas" w:hAnsi="Consolas" w:eastAsia="Consolas"/>
+          <w:sz w:val="20"/>
+        </w:rPr>
+        <w:t xml:space="preserve">  --period 300 `</w:t>
+      </w:r>
+    </w:p>
+    <w:p>
+      <w:r>
+        <w:rPr>
+          <w:rFonts w:ascii="Consolas" w:hAnsi="Consolas" w:eastAsia="Consolas"/>
+          <w:sz w:val="20"/>
+        </w:rPr>
+        <w:t xml:space="preserve">  --statistics Average Maximum</w:t>
+      </w:r>
+    </w:p>
+    <w:p/>
+    <w:p>
+      <w:r>
+        <w:t>Memory:</w:t>
+      </w:r>
+    </w:p>
+    <w:p/>
+    <w:p>
+      <w:r>
+        <w:rPr>
+          <w:rFonts w:ascii="Consolas" w:hAnsi="Consolas" w:eastAsia="Consolas"/>
+          <w:sz w:val="20"/>
+        </w:rPr>
+        <w:t>aws cloudwatch get-metric-statistics `</w:t>
+      </w:r>
+    </w:p>
+    <w:p>
+      <w:r>
+        <w:rPr>
+          <w:rFonts w:ascii="Consolas" w:hAnsi="Consolas" w:eastAsia="Consolas"/>
+          <w:sz w:val="20"/>
+        </w:rPr>
+        <w:t xml:space="preserve">  --region ap-south-2 `</w:t>
+      </w:r>
+    </w:p>
+    <w:p>
+      <w:r>
+        <w:rPr>
+          <w:rFonts w:ascii="Consolas" w:hAnsi="Consolas" w:eastAsia="Consolas"/>
+          <w:sz w:val="20"/>
+        </w:rPr>
+        <w:t xml:space="preserve">  --namespace AWS/ECS `</w:t>
+      </w:r>
+    </w:p>
+    <w:p>
+      <w:r>
+        <w:rPr>
+          <w:rFonts w:ascii="Consolas" w:hAnsi="Consolas" w:eastAsia="Consolas"/>
+          <w:sz w:val="20"/>
+        </w:rPr>
+        <w:t xml:space="preserve">  --metric-name MemoryUtilization `</w:t>
+      </w:r>
+    </w:p>
+    <w:p>
+      <w:r>
+        <w:rPr>
+          <w:rFonts w:ascii="Consolas" w:hAnsi="Consolas" w:eastAsia="Consolas"/>
+          <w:sz w:val="20"/>
+        </w:rPr>
+        <w:t xml:space="preserve">  --dimensions Name=ClusterName,Value=cheeko-agents-cluster Name=ServiceName,Value=cheeko-agent-service `</w:t>
+      </w:r>
+    </w:p>
+    <w:p>
+      <w:r>
+        <w:rPr>
+          <w:rFonts w:ascii="Consolas" w:hAnsi="Consolas" w:eastAsia="Consolas"/>
+          <w:sz w:val="20"/>
+        </w:rPr>
+        <w:t xml:space="preserve">  --start-time $start `</w:t>
+      </w:r>
+    </w:p>
+    <w:p>
+      <w:r>
+        <w:rPr>
+          <w:rFonts w:ascii="Consolas" w:hAnsi="Consolas" w:eastAsia="Consolas"/>
+          <w:sz w:val="20"/>
+        </w:rPr>
+        <w:t xml:space="preserve">  --end-time $end `</w:t>
+      </w:r>
+    </w:p>
+    <w:p>
+      <w:r>
+        <w:rPr>
+          <w:rFonts w:ascii="Consolas" w:hAnsi="Consolas" w:eastAsia="Consolas"/>
+          <w:sz w:val="20"/>
+        </w:rPr>
+        <w:t xml:space="preserve">  --period 300 `</w:t>
+      </w:r>
+    </w:p>
+    <w:p>
+      <w:r>
+        <w:rPr>
+          <w:rFonts w:ascii="Consolas" w:hAnsi="Consolas" w:eastAsia="Consolas"/>
+          <w:sz w:val="20"/>
+        </w:rPr>
+        <w:t xml:space="preserve">  --statistics Average Maximum</w:t>
+      </w:r>
+    </w:p>
+    <w:p/>
+    <w:p>
+      <w:r>
+        <w:t>Interpretation:</w:t>
+      </w:r>
+    </w:p>
+    <w:p/>
+    <w:p>
+      <w:pPr>
+        <w:pStyle w:val="ListBullet"/>
+      </w:pPr>
+      <w:r>
+        <w:t>CPU target policy is currently `50%`, so values like `0.5%` to `1.5%` are very low and will keep service near min capacity (`1` task).</w:t>
+      </w:r>
+    </w:p>
+    <w:p>
+      <w:pPr>
+        <w:pStyle w:val="ListBullet"/>
+      </w:pPr>
+      <w:r>
+        <w:t>Memory around `10%` on a `4096 MB` task is about `410 MB` usage (`4096 * 0.10`).</w:t>
+      </w:r>
+    </w:p>
+    <w:p>
+      <w:pPr>
+        <w:pStyle w:val="ListBullet"/>
+      </w:pPr>
+      <w:r>
+        <w:t>This is a healthy low-load baseline.</w:t>
+      </w:r>
+    </w:p>
+    <w:p/>
+    <w:p>
+      <w:pPr>
         <w:pStyle w:val="Heading2"/>
       </w:pPr>
       <w:r>
@@ -1060,6 +1454,14 @@
       </w:pPr>
       <w:r>
         <w:t>`deploy/aws/cheeko-agent/create-or-update-service.ps1`</w:t>
+      </w:r>
+    </w:p>
+    <w:p>
+      <w:pPr>
+        <w:pStyle w:val="ListBullet"/>
+      </w:pPr>
+      <w:r>
+        <w:t>`deploy/aws/cheeko-agent/configure-autoscaling.ps1`</w:t>
       </w:r>
     </w:p>
     <w:p>

</xml_diff>